<commit_message>
feat(lab): introduce shared app shell and streamline demo setup
Migrate all frontend apps to a shared, collapsible AppShell and reusable
navigation list, with unified theme, layout documentation, and Vite aliases.

Standardize demo host-port allocation, name NATS connections for observability,
and avoid refdata cache notifications when a localization is unchanged.
Prime cached labels and UI copy immediately when switching locales.

Refresh architecture, compose, Swagger, diagrams, plans, and supporting docs,
including the initial multi-region requirements draft.
</commit_message>
<xml_diff>
--- a/obsidian/V3-Platform/System Design - V3 Logistics Platform.docx
+++ b/obsidian/V3-Platform/System Design - V3 Logistics Platform.docx
@@ -945,7 +945,7 @@
         <w:spacing w:after="120" w:line="276"/>
       </w:pPr>
       <w:r>
-        <w:t xml:space="preserve">It is a system overview, not a component-level design. It is not a requirements document (no SRS exists yet for V3) and not an approved design — it exists to seed the round-2 architecture meeting with a single written artifact instead of scattered Slack threads.</w:t>
+        <w:t xml:space="preserve">It is a system overview, not a component-level design. Section 1.3 captures the high-level requirements confirmed so far; a full SRS still does not exist for V3. It is not an approved design — it exists to seed the round-2 architecture meeting with a single written artifact instead of scattered Slack threads.</w:t>
       </w:r>
     </w:p>
     <w:p>
@@ -993,7 +993,15 @@
           <w:sz w:val="24"/>
           <w:szCs w:val="24"/>
         </w:rPr>
-        <w:t xml:space="preserve">1.3 Design Goals</w:t>
+        <w:t xml:space="preserve">1.3 High-Level Requirements</w:t>
+      </w:r>
+    </w:p>
+    <w:p>
+      <w:pPr>
+        <w:spacing w:after="120" w:line="276"/>
+      </w:pPr>
+      <w:r>
+        <w:t xml:space="preserve">These are the platform-level requirements the round-2 review is being asked to confirm; none are final. Component-level detail, where it exists, lives in the referenced POC notes rather than here.</w:t>
       </w:r>
     </w:p>
     <w:p>
@@ -1006,7 +1014,7 @@
         <w:spacing w:after="60" w:line="276"/>
       </w:pPr>
       <w:r>
-        <w:t xml:space="preserve">Scalability to handle multi-tenant SaaS load across regions.</w:t>
+        <w:t xml:space="preserve">Multi-region: the platform must run across multiple geographic regions from day one — data residency, latency, and regional failover are first-class concerns, not later retrofits. See Section 8 (data residency/compliance routing) and Section 9 (regions assumed multi-region, contingent on Path A).</w:t>
       </w:r>
     </w:p>
     <w:p>
@@ -1019,7 +1027,7 @@
         <w:spacing w:after="60" w:line="276"/>
       </w:pPr>
       <w:r>
-        <w:t xml:space="preserve">High availability for whichever services end up latency-sensitive (Tracking, GEO are the obvious candidates once designed).</w:t>
+        <w:t xml:space="preserve">Multi-tenant with isolated environments: V3 is multi-tenant SaaS; each tenant’s data and environment must be isolated. Today only soft isolation (subject-prefix pattern, DD-04) is evaluated — hard isolation (one NATS Account per tenant) remains an open item (Section 12.B).</w:t>
       </w:r>
     </w:p>
     <w:p>
@@ -1032,7 +1040,7 @@
         <w:spacing w:after="60" w:line="276"/>
       </w:pPr>
       <w:r>
-        <w:t xml:space="preserve">Extensibility to onboard new tenants/regions without re-architecting the backbone.</w:t>
+        <w:t xml:space="preserve">Modularized / isolated services: source may live in one monorepo, but each candidate service (Section 3) deploys and scales independently, with its own Postgres schema. How service deployments and cross-service dependencies are versioned and sequenced in production is not yet decided — open item, Section 12.B. A service’s frontend may be packaged and deployed as part of that service (vertical slice) rather than a single platform-wide frontend — open question, unresolved against the lab’s current lab-shell-plus-per-demo-frontend pattern.</w:t>
       </w:r>
     </w:p>
     <w:p>
@@ -1045,7 +1053,7 @@
         <w:spacing w:after="60" w:line="276"/>
       </w:pPr>
       <w:r>
-        <w:t xml:space="preserve">Maintainability via clear service boundaries — one service per candidate box, own VM/container, own Postgres schema.</w:t>
+        <w:t xml:space="preserve">Authentication and Fine-Grained Authorization: AuthN via a managed identity provider (authentik candidate, not confirmed) plus AuthZ via ReBAC/FGA (OpenFGA/Zanzibar-style relation tuples), proposed to answer “who can see what” at tenant/org/user/role/document granularity. NATS NSC scoped signing keys were evaluated and rejected as too coarse for this alone (DD-06). See Section 8.</w:t>
       </w:r>
     </w:p>
     <w:p>
@@ -1058,17 +1066,23 @@
         <w:spacing w:after="60" w:line="276"/>
       </w:pPr>
       <w:r>
-        <w:t xml:space="preserve">Auditability — but </w:t>
-      </w:r>
-      <w:r>
-        <w:rPr>
-          <w:b/>
-          <w:bCs/>
-        </w:rPr>
-        <w:t xml:space="preserve">only where something actually needs to replay history</w:t>
-      </w:r>
-      <w:r>
-        <w:t xml:space="preserve"> (see the event-sourcing-vs-CRUD heuristic in Section 11, DD-03). Not every service needs an event log by default.</w:t>
+        <w:t xml:space="preserve">Globalization: localization (i18n/translation strings with locale fallback, prototyped in the Dictionary POC per BR-D03), tenant/region-specific configuration, and reference data (dictionaries, enums, lookup values) distributed via the Postgres-source-of-truth-plus-NATS-KV-cache pattern validated by that POC (DD-01).</w:t>
+      </w:r>
+    </w:p>
+    <w:p>
+      <w:pPr>
+        <w:pStyle w:val="Heading2"/>
+        <w:spacing w:after="100" w:before="220"/>
+      </w:pPr>
+      <w:r>
+        <w:rPr>
+          <w:b/>
+          <w:bCs/>
+          <w:color w:val="2E5496"/>
+          <w:sz w:val="24"/>
+          <w:szCs w:val="24"/>
+        </w:rPr>
+        <w:t xml:space="preserve">1.4 Design Goals</w:t>
       </w:r>
     </w:p>
     <w:p>
@@ -1081,6 +1095,81 @@
         <w:spacing w:after="60" w:line="276"/>
       </w:pPr>
       <w:r>
+        <w:t xml:space="preserve">Scalability to handle multi-tenant SaaS load across regions.</w:t>
+      </w:r>
+    </w:p>
+    <w:p>
+      <w:pPr>
+        <w:pStyle w:val="ListParagraph"/>
+        <w:numPr>
+          <w:ilvl w:val="0"/>
+          <w:numId w:val="2"/>
+        </w:numPr>
+        <w:spacing w:after="60" w:line="276"/>
+      </w:pPr>
+      <w:r>
+        <w:t xml:space="preserve">High availability for whichever services end up latency-sensitive (Tracking, GEO are the obvious candidates once designed).</w:t>
+      </w:r>
+    </w:p>
+    <w:p>
+      <w:pPr>
+        <w:pStyle w:val="ListParagraph"/>
+        <w:numPr>
+          <w:ilvl w:val="0"/>
+          <w:numId w:val="2"/>
+        </w:numPr>
+        <w:spacing w:after="60" w:line="276"/>
+      </w:pPr>
+      <w:r>
+        <w:t xml:space="preserve">Extensibility to onboard new tenants/regions without re-architecting the backbone.</w:t>
+      </w:r>
+    </w:p>
+    <w:p>
+      <w:pPr>
+        <w:pStyle w:val="ListParagraph"/>
+        <w:numPr>
+          <w:ilvl w:val="0"/>
+          <w:numId w:val="2"/>
+        </w:numPr>
+        <w:spacing w:after="60" w:line="276"/>
+      </w:pPr>
+      <w:r>
+        <w:t xml:space="preserve">Maintainability via clear service boundaries — one service per candidate box, own VM/container, own Postgres schema.</w:t>
+      </w:r>
+    </w:p>
+    <w:p>
+      <w:pPr>
+        <w:pStyle w:val="ListParagraph"/>
+        <w:numPr>
+          <w:ilvl w:val="0"/>
+          <w:numId w:val="2"/>
+        </w:numPr>
+        <w:spacing w:after="60" w:line="276"/>
+      </w:pPr>
+      <w:r>
+        <w:t xml:space="preserve">Auditability — but </w:t>
+      </w:r>
+      <w:r>
+        <w:rPr>
+          <w:b/>
+          <w:bCs/>
+        </w:rPr>
+        <w:t xml:space="preserve">only where something actually needs to replay history</w:t>
+      </w:r>
+      <w:r>
+        <w:t xml:space="preserve"> (see the event-sourcing-vs-CRUD heuristic in Section 11, DD-03). Not every service needs an event log by default.</w:t>
+      </w:r>
+    </w:p>
+    <w:p>
+      <w:pPr>
+        <w:pStyle w:val="ListParagraph"/>
+        <w:numPr>
+          <w:ilvl w:val="0"/>
+          <w:numId w:val="2"/>
+        </w:numPr>
+        <w:spacing w:after="60" w:line="276"/>
+      </w:pPr>
+      <w:r>
         <w:t xml:space="preserve">A settled responsibility split between JetStream, NATS KV, and Postgres — this is the platform’s open architectural question and the reason the lab exists.</w:t>
       </w:r>
     </w:p>
@@ -1097,7 +1186,7 @@
           <w:sz w:val="24"/>
           <w:szCs w:val="24"/>
         </w:rPr>
-        <w:t xml:space="preserve">1.4 References</w:t>
+        <w:t xml:space="preserve">1.5 References</w:t>
       </w:r>
     </w:p>
     <w:p>

</xml_diff>